<commit_message>
Added visual onboarding modal with screenshot logic
</commit_message>
<xml_diff>
--- a/Instructions/🎾 Padel Pro Scoreboard.docx
+++ b/Instructions/🎾 Padel Pro Scoreboard.docx
@@ -67,15 +67,7 @@
         <w:t>Flic Button:</w:t>
       </w:r>
       <w:r>
-        <w:t xml:space="preserve"> Strap the Flic button to the server’s wrist or clip it to their shirt. Make sure it is connected to the tablet via Bluetooth/</w:t>
-      </w:r>
-      <w:proofErr w:type="spellStart"/>
-      <w:r>
-        <w:t>MacroDroid</w:t>
-      </w:r>
-      <w:proofErr w:type="spellEnd"/>
-      <w:r>
-        <w:t>.</w:t>
+        <w:t xml:space="preserve"> Strap the Flic button to the server’s wrist or clip it to their shirt. Make sure it is connected to the tablet via Bluetooth</w:t>
       </w:r>
     </w:p>
     <w:p>
@@ -249,21 +241,12 @@
       <w:r>
         <w:t xml:space="preserve"> or </w:t>
       </w:r>
-      <w:proofErr w:type="gramStart"/>
-      <w:r>
-        <w:rPr>
-          <w:b/>
-          <w:bCs/>
-        </w:rPr>
-        <w:t>Best</w:t>
-      </w:r>
-      <w:proofErr w:type="gramEnd"/>
-      <w:r>
-        <w:rPr>
-          <w:b/>
-          <w:bCs/>
-        </w:rPr>
-        <w:t xml:space="preserve"> of 5</w:t>
+      <w:r>
+        <w:rPr>
+          <w:b/>
+          <w:bCs/>
+        </w:rPr>
+        <w:t>Best of 5</w:t>
       </w:r>
       <w:r>
         <w:t xml:space="preserve"> sets.</w:t>
@@ -1729,6 +1712,7 @@
   <w:style w:type="character" w:default="1" w:styleId="DefaultParagraphFont">
     <w:name w:val="Default Paragraph Font"/>
     <w:uiPriority w:val="1"/>
+    <w:semiHidden/>
     <w:unhideWhenUsed/>
   </w:style>
   <w:style w:type="table" w:default="1" w:styleId="TableNormal">

</xml_diff>